<commit_message>
Added DOCX export. Continuing to debug ODT exports
</commit_message>
<xml_diff>
--- a/writerbase/writertest.docx
+++ b/writerbase/writertest.docx
@@ -18,25 +18,48 @@
         <w:pStyle w:val="Heading1"/>
       </w:pPr>
       <w:r>
-        <w:rPr>
-          <w:rFonts w:ascii="Courier New"/>
-          <w:b/>
-        </w:rPr>
         <w:t>writertest</w:t>
+      </w:r>
+    </w:p>
+    <w:p>
+      <w:r>
+        <w:br w:type="page"/>
       </w:r>
     </w:p>
     <w:p>
       <w:pPr>
         <w:jc w:val="center"/>
+        <w:pStyle w:val="Heading1"/>
       </w:pPr>
       <w:r>
-        <w:rPr>
-          <w:rFonts w:ascii="Courier New"/>
-        </w:rPr>
-        <w:t>Description: based</w:t>
+        <w:t>Table of Contents</w:t>
       </w:r>
     </w:p>
     <w:p/>
+    <w:p>
+      <w:pPr>
+        <w:pStyle w:val="Heading2"/>
+      </w:pPr>
+      <w:r>
+        <w:t>Chapter 1: Hello</w:t>
+      </w:r>
+    </w:p>
+    <w:p>
+      <w:pPr>
+        <w:pStyle w:val="Heading2"/>
+      </w:pPr>
+      <w:r>
+        <w:t>Chapter 2: Ch2</w:t>
+      </w:r>
+    </w:p>
+    <w:p>
+      <w:pPr>
+        <w:pStyle w:val="Heading2"/>
+      </w:pPr>
+      <w:r>
+        <w:t>Chapter 3: Ch3</w:t>
+      </w:r>
+    </w:p>
     <w:p>
       <w:r>
         <w:br w:type="page"/>
@@ -47,10 +70,6 @@
         <w:pStyle w:val="Heading2"/>
       </w:pPr>
       <w:r>
-        <w:rPr>
-          <w:rFonts w:ascii="Courier New"/>
-          <w:b/>
-        </w:rPr>
         <w:t>Chapter 1: Hello</w:t>
       </w:r>
     </w:p>
@@ -60,17 +79,13 @@
         <w:pStyle w:val="Heading2"/>
       </w:pPr>
       <w:r>
-        <w:rPr>
-          <w:rFonts w:ascii="Courier New"/>
-          <w:b/>
-        </w:rPr>
         <w:t>Chapter 2: Ch2</w:t>
       </w:r>
     </w:p>
     <w:p>
       <w:r>
         <w:rPr>
-          <w:rFonts w:ascii="Courier New"/>
+          <w:rFonts w:ascii="Courier New" w:hAnsi="Courier New"/>
         </w:rPr>
         <w:t>aboewuhfuewjoiwejfoi</w:t>
       </w:r>
@@ -81,17 +96,13 @@
         <w:pStyle w:val="Heading2"/>
       </w:pPr>
       <w:r>
-        <w:rPr>
-          <w:rFonts w:ascii="Courier New"/>
-          <w:b/>
-        </w:rPr>
         <w:t>Chapter 3: Ch3</w:t>
       </w:r>
     </w:p>
     <w:p>
       <w:r>
         <w:rPr>
-          <w:rFonts w:ascii="Courier New"/>
+          <w:rFonts w:ascii="Courier New" w:hAnsi="Courier New"/>
         </w:rPr>
         <w:t>I am the very model of a modern major general the venerated Virginian veteran whose men are all lining up to put him up on a pedestal</w:t>
       </w:r>
@@ -99,4 +110,33 @@
     <w:p/>
   </w:body>
 </w:document>
+</file>
+
+<file path=word/styles.xml><?xml version="1.0" encoding="utf-8"?>
+<w:styles xmlns:w="http://schemas.openxmlformats.org/wordprocessingml/2006/main">
+  <w:style w:type="paragraph" w:styleId="Heading1">
+    <w:name w:val="Heading 1"/>
+    <w:basedOn w:val="Normal"/>
+    <w:next w:val="Normal"/>
+    <w:uiPriority w:val="9"/>
+    <w:qFormat/>
+    <w:rPr>
+      <w:rFonts w:ascii="Courier New" w:hAnsi="Courier New"/>
+      <w:b/>
+      <w:sz w:val="32"/>
+    </w:rPr>
+  </w:style>
+  <w:style w:type="paragraph" w:styleId="Heading2">
+    <w:name w:val="Heading 2"/>
+    <w:basedOn w:val="Normal"/>
+    <w:next w:val="Normal"/>
+    <w:uiPriority w:val="9"/>
+    <w:qFormat/>
+    <w:rPr>
+      <w:rFonts w:ascii="Courier New" w:hAnsi="Courier New"/>
+      <w:b/>
+      <w:sz w:val="28"/>
+    </w:rPr>
+  </w:style>
+</w:styles>
 </file>
</xml_diff>